<commit_message>
Replace pipe-separated skill lists with labeled bullet groups
The pipe-delimited core competencies line read as an unscannable wall of
text. Restructure it into seven labeled capability groups as bullets, each
with comma-separated skills, and drop the tool names that duplicated the
technical skills section.

Apply the same change to the certification topic lists, which had the same
problem. Both stay single-column and keyword-dense for ATS parsing.

Only the ATS resume is affected; the formatted resume already used bulleted
two-column skill lists.

Co-Authored-By: Claude Opus 5 <noreply@anthropic.com>
Claude-Session: https://claude.ai/code/session_01HT2MRUrsbUrG9a2gKe4mA2
</commit_message>
<xml_diff>
--- a/resume/April-Rose-Mondejar-SEO-Resume-ATS.docx
+++ b/resume/April-Rose-Mondejar-SEO-Resume-ATS.docx
@@ -131,30 +131,124 @@
     </w:p>
     <w:p>
       <w:pPr>
-        <w:spacing w:after="60" w:line="252"/>
-      </w:pPr>
-      <w:r>
-        <w:rPr>
-          <w:rFonts w:ascii="Calibri" w:cs="Calibri" w:eastAsia="Calibri" w:hAnsi="Calibri"/>
-          <w:b/>
-          <w:bCs/>
-          <w:sz w:val="22"/>
-          <w:szCs w:val="22"/>
-        </w:rPr>
-        <w:t xml:space="preserve">Search Engine Optimization:</w:t>
-      </w:r>
-      <w:r>
-        <w:rPr>
-          <w:rFonts w:ascii="Calibri" w:cs="Calibri" w:eastAsia="Calibri" w:hAnsi="Calibri"/>
-          <w:sz w:val="22"/>
-          <w:szCs w:val="22"/>
-        </w:rPr>
-        <w:t xml:space="preserve"> Technical SEO | Ecommerce SEO | On-Page SEO | Local SEO | International SEO | SEO Audits | Crawl and Indexation Management | Site Architecture | Internal Linking | Schema Markup | Core Web Vitals | Site Migrations | Link Building</w:t>
-      </w:r>
-    </w:p>
-    <w:p>
-      <w:pPr>
-        <w:spacing w:after="60" w:line="252"/>
+        <w:pStyle w:val="ListParagraph"/>
+        <w:numPr>
+          <w:ilvl w:val="0"/>
+          <w:numId w:val="2"/>
+        </w:numPr>
+        <w:spacing w:after="40" w:line="252"/>
+      </w:pPr>
+      <w:r>
+        <w:rPr>
+          <w:rFonts w:ascii="Calibri" w:cs="Calibri" w:eastAsia="Calibri" w:hAnsi="Calibri"/>
+          <w:b/>
+          <w:bCs/>
+          <w:sz w:val="22"/>
+          <w:szCs w:val="22"/>
+        </w:rPr>
+        <w:t xml:space="preserve">Technical SEO:</w:t>
+      </w:r>
+      <w:r>
+        <w:rPr>
+          <w:rFonts w:ascii="Calibri" w:cs="Calibri" w:eastAsia="Calibri" w:hAnsi="Calibri"/>
+          <w:sz w:val="22"/>
+          <w:szCs w:val="22"/>
+        </w:rPr>
+        <w:t xml:space="preserve"> SEO audits, crawl and indexation management, site architecture, schema markup, Core Web Vitals, site migrations</w:t>
+      </w:r>
+    </w:p>
+    <w:p>
+      <w:pPr>
+        <w:pStyle w:val="ListParagraph"/>
+        <w:numPr>
+          <w:ilvl w:val="0"/>
+          <w:numId w:val="2"/>
+        </w:numPr>
+        <w:spacing w:after="40" w:line="252"/>
+      </w:pPr>
+      <w:r>
+        <w:rPr>
+          <w:rFonts w:ascii="Calibri" w:cs="Calibri" w:eastAsia="Calibri" w:hAnsi="Calibri"/>
+          <w:b/>
+          <w:bCs/>
+          <w:sz w:val="22"/>
+          <w:szCs w:val="22"/>
+        </w:rPr>
+        <w:t xml:space="preserve">On-Page and Content SEO:</w:t>
+      </w:r>
+      <w:r>
+        <w:rPr>
+          <w:rFonts w:ascii="Calibri" w:cs="Calibri" w:eastAsia="Calibri" w:hAnsi="Calibri"/>
+          <w:sz w:val="22"/>
+          <w:szCs w:val="22"/>
+        </w:rPr>
+        <w:t xml:space="preserve"> on-page optimization, keyword research, search intent analysis, topic clusters, content briefs, content gap analysis</w:t>
+      </w:r>
+    </w:p>
+    <w:p>
+      <w:pPr>
+        <w:pStyle w:val="ListParagraph"/>
+        <w:numPr>
+          <w:ilvl w:val="0"/>
+          <w:numId w:val="2"/>
+        </w:numPr>
+        <w:spacing w:after="40" w:line="252"/>
+      </w:pPr>
+      <w:r>
+        <w:rPr>
+          <w:rFonts w:ascii="Calibri" w:cs="Calibri" w:eastAsia="Calibri" w:hAnsi="Calibri"/>
+          <w:b/>
+          <w:bCs/>
+          <w:sz w:val="22"/>
+          <w:szCs w:val="22"/>
+        </w:rPr>
+        <w:t xml:space="preserve">Off-Page SEO:</w:t>
+      </w:r>
+      <w:r>
+        <w:rPr>
+          <w:rFonts w:ascii="Calibri" w:cs="Calibri" w:eastAsia="Calibri" w:hAnsi="Calibri"/>
+          <w:sz w:val="22"/>
+          <w:szCs w:val="22"/>
+        </w:rPr>
+        <w:t xml:space="preserve"> link building, digital PR outreach, internal linking strategy</w:t>
+      </w:r>
+    </w:p>
+    <w:p>
+      <w:pPr>
+        <w:pStyle w:val="ListParagraph"/>
+        <w:numPr>
+          <w:ilvl w:val="0"/>
+          <w:numId w:val="2"/>
+        </w:numPr>
+        <w:spacing w:after="40" w:line="252"/>
+      </w:pPr>
+      <w:r>
+        <w:rPr>
+          <w:rFonts w:ascii="Calibri" w:cs="Calibri" w:eastAsia="Calibri" w:hAnsi="Calibri"/>
+          <w:b/>
+          <w:bCs/>
+          <w:sz w:val="22"/>
+          <w:szCs w:val="22"/>
+        </w:rPr>
+        <w:t xml:space="preserve">Ecommerce and Local SEO:</w:t>
+      </w:r>
+      <w:r>
+        <w:rPr>
+          <w:rFonts w:ascii="Calibri" w:cs="Calibri" w:eastAsia="Calibri" w:hAnsi="Calibri"/>
+          <w:sz w:val="22"/>
+          <w:szCs w:val="22"/>
+        </w:rPr>
+        <w:t xml:space="preserve"> Shopify and WooCommerce SEO, product and category page optimization, local SEO, international SEO</w:t>
+      </w:r>
+    </w:p>
+    <w:p>
+      <w:pPr>
+        <w:pStyle w:val="ListParagraph"/>
+        <w:numPr>
+          <w:ilvl w:val="0"/>
+          <w:numId w:val="2"/>
+        </w:numPr>
+        <w:spacing w:after="40" w:line="252"/>
       </w:pPr>
       <w:r>
         <w:rPr>
@@ -172,58 +266,45 @@
           <w:sz w:val="22"/>
           <w:szCs w:val="22"/>
         </w:rPr>
-        <w:t xml:space="preserve"> Generative Engine Optimization (GEO) | Answer Engine Optimization (AEO) | AI Overviews and AI Mode Optimization | LLM Brand Visibility and Citation Tracking | Entity SEO and Knowledge Graph Optimization | E-E-A-T Signals | Structured Data for AI Retrieval | AI-Assisted SEO Workflows and Automation</w:t>
-      </w:r>
-    </w:p>
-    <w:p>
-      <w:pPr>
-        <w:spacing w:after="60" w:line="252"/>
-      </w:pPr>
-      <w:r>
-        <w:rPr>
-          <w:rFonts w:ascii="Calibri" w:cs="Calibri" w:eastAsia="Calibri" w:hAnsi="Calibri"/>
-          <w:b/>
-          <w:bCs/>
-          <w:sz w:val="22"/>
-          <w:szCs w:val="22"/>
-        </w:rPr>
-        <w:t xml:space="preserve">Content and Research:</w:t>
-      </w:r>
-      <w:r>
-        <w:rPr>
-          <w:rFonts w:ascii="Calibri" w:cs="Calibri" w:eastAsia="Calibri" w:hAnsi="Calibri"/>
-          <w:sz w:val="22"/>
-          <w:szCs w:val="22"/>
-        </w:rPr>
-        <w:t xml:space="preserve"> Keyword Research | Search Intent Analysis | Topic Clusters | Content Briefs | Content Optimization | Competitor and Content Gap Analysis | Editorial Planning</w:t>
-      </w:r>
-    </w:p>
-    <w:p>
-      <w:pPr>
-        <w:spacing w:after="60" w:line="252"/>
-      </w:pPr>
-      <w:r>
-        <w:rPr>
-          <w:rFonts w:ascii="Calibri" w:cs="Calibri" w:eastAsia="Calibri" w:hAnsi="Calibri"/>
-          <w:b/>
-          <w:bCs/>
-          <w:sz w:val="22"/>
-          <w:szCs w:val="22"/>
-        </w:rPr>
-        <w:t xml:space="preserve">Analytics and Reporting:</w:t>
-      </w:r>
-      <w:r>
-        <w:rPr>
-          <w:rFonts w:ascii="Calibri" w:cs="Calibri" w:eastAsia="Calibri" w:hAnsi="Calibri"/>
-          <w:sz w:val="22"/>
-          <w:szCs w:val="22"/>
-        </w:rPr>
-        <w:t xml:space="preserve"> Google Search Console | Google Analytics 4 | Looker Studio | Google Tag Manager | Rank Tracking | Performance Reporting</w:t>
-      </w:r>
-    </w:p>
-    <w:p>
-      <w:pPr>
-        <w:spacing w:after="60" w:line="252"/>
+        <w:t xml:space="preserve"> Generative Engine Optimization (GEO), Answer Engine Optimization (AEO), AI Overviews optimization, LLM brand visibility and citation tracking, entity SEO, E-E-A-T signals</w:t>
+      </w:r>
+    </w:p>
+    <w:p>
+      <w:pPr>
+        <w:pStyle w:val="ListParagraph"/>
+        <w:numPr>
+          <w:ilvl w:val="0"/>
+          <w:numId w:val="2"/>
+        </w:numPr>
+        <w:spacing w:after="40" w:line="252"/>
+      </w:pPr>
+      <w:r>
+        <w:rPr>
+          <w:rFonts w:ascii="Calibri" w:cs="Calibri" w:eastAsia="Calibri" w:hAnsi="Calibri"/>
+          <w:b/>
+          <w:bCs/>
+          <w:sz w:val="22"/>
+          <w:szCs w:val="22"/>
+        </w:rPr>
+        <w:t xml:space="preserve">Analytics and Measurement:</w:t>
+      </w:r>
+      <w:r>
+        <w:rPr>
+          <w:rFonts w:ascii="Calibri" w:cs="Calibri" w:eastAsia="Calibri" w:hAnsi="Calibri"/>
+          <w:sz w:val="22"/>
+          <w:szCs w:val="22"/>
+        </w:rPr>
+        <w:t xml:space="preserve"> organic performance analysis, rank tracking, internal linking reports, reporting and insights</w:t>
+      </w:r>
+    </w:p>
+    <w:p>
+      <w:pPr>
+        <w:pStyle w:val="ListParagraph"/>
+        <w:numPr>
+          <w:ilvl w:val="0"/>
+          <w:numId w:val="2"/>
+        </w:numPr>
+        <w:spacing w:after="40" w:line="252"/>
       </w:pPr>
       <w:r>
         <w:rPr>
@@ -241,7 +322,7 @@
           <w:sz w:val="22"/>
           <w:szCs w:val="22"/>
         </w:rPr>
-        <w:t xml:space="preserve"> WordPress | Shopify | Webflow | WooCommerce | HTML | CSS | Responsive and Mobile Optimization</w:t>
+        <w:t xml:space="preserve"> WordPress, Shopify, Webflow, WooCommerce, HTML, CSS, responsive and mobile optimization</w:t>
       </w:r>
     </w:p>
     <w:p>
@@ -1586,7 +1667,7 @@
           <w:sz w:val="22"/>
           <w:szCs w:val="22"/>
         </w:rPr>
-        <w:t xml:space="preserve">Data Analysis | SQL | Spreadsheet Software | Business Analysis | Business Communication | Data Visualization | Data Management | General Statistics</w:t>
+        <w:t xml:space="preserve">Data Analysis, SQL, Spreadsheet Software, Business Analysis, Business Communication, Data Visualization, Data Management, General Statistics</w:t>
       </w:r>
     </w:p>
     <w:p>
@@ -1614,7 +1695,7 @@
           <w:sz w:val="22"/>
           <w:szCs w:val="22"/>
         </w:rPr>
-        <w:t xml:space="preserve">Content Groupings | Advanced Marketing Tools | Custom Dimensions and Metrics | Google Tag Manager | Data Collection and Processing | Assisted Conversions | Custom Reporting | Segments | User ID Tracking</w:t>
+        <w:t xml:space="preserve">Content Groupings, Advanced Marketing Tools, Custom Dimensions and Metrics, Google Tag Manager, Data Collection and Processing, Assisted Conversions, Custom Reporting, Segments, User ID Tracking</w:t>
       </w:r>
     </w:p>
     <w:p>
@@ -1642,7 +1723,7 @@
           <w:sz w:val="22"/>
           <w:szCs w:val="22"/>
         </w:rPr>
-        <w:t xml:space="preserve">Local SEO Techniques and Strategy | Creating an Internal Link building Strategy | Off page SEO Tactic: Niche edits | Off page SEO Tactic: HARO | Off page SEO Tactic: Roundup | Creating Off Page Link Building Strategy | Creating an SEO Strategy based on site audit | Content Audit and Consolidation</w:t>
+        <w:t xml:space="preserve">Local SEO Techniques and Strategy, Creating an Internal Link building Strategy, Off page SEO Tactic: Niche edits, Off page SEO Tactic: HARO, Off page SEO Tactic: Roundup, Creating Off Page Link Building Strategy, Creating an SEO Strategy based on site audit, Content Audit and Consolidation</w:t>
       </w:r>
     </w:p>
     <w:p>
@@ -1670,7 +1751,7 @@
           <w:sz w:val="22"/>
           <w:szCs w:val="22"/>
         </w:rPr>
-        <w:t xml:space="preserve">On-Page Optimization | Off-Page Optimization | Technical Optimization | Keyword Strategy | International SEO | Link building</w:t>
+        <w:t xml:space="preserve">On-Page Optimization, Off-Page Optimization, Technical Optimization, Keyword Strategy, International SEO, Link building</w:t>
       </w:r>
     </w:p>
     <w:p>
@@ -1698,7 +1779,7 @@
           <w:sz w:val="22"/>
           <w:szCs w:val="22"/>
         </w:rPr>
-        <w:t xml:space="preserve">Domain and Hosting Setup | Design and Development | Plugins | Content Creation | SEO Fundamentals | Woo-Commerce</w:t>
+        <w:t xml:space="preserve">Domain and Hosting Setup, Design and Development, Plugins, Content Creation, SEO Fundamentals, Woo-Commerce</w:t>
       </w:r>
     </w:p>
     <w:sectPr>

</xml_diff>